<commit_message>
Month 3 fixes : 1. Add aggregate evidence scoring 2. Align calibration and live inference feature extraction 3. Add optional transcript input for speech rate 4. Add citation/source metadata per graph edge 5. Add LLM faithfulness checking
</commit_message>
<xml_diff>
--- a/docs/thesis_report_current_work_draft.docx
+++ b/docs/thesis_report_current_work_draft.docx
@@ -1346,6 +1346,99 @@
           <w:szCs w:val="24"/>
         </w:rPr>
         <w:t>I built the graph manually as a lightweight clinical ontology. The biomarker nodes were selected from speech-depression literature, especially Cummins et al., Low et al., Al Hanai et al., and Scherer et al. The clinical screening part is grounded in PHQ-8 literature, especially Kroenke et al., and the dataset structure follows DAIC-WOZ from Gratch et al. The graph does not claim direct diagnosis. It represents cautious literature-grounded reasoning paths from acoustic biomarkers to clinical concepts, PHQ-8 screening context, risk, and follow-u</w:t>
+      </w:r>
+    </w:p>
+    <w:p>
+      <w:pPr>
+        <w:rPr>
+          <w:rFonts w:ascii="SimSun" w:hAnsi="SimSun" w:eastAsia="SimSun" w:cs="SimSun"/>
+          <w:sz w:val="24"/>
+          <w:szCs w:val="24"/>
+        </w:rPr>
+      </w:pPr>
+    </w:p>
+    <w:p>
+      <w:pPr>
+        <w:rPr>
+          <w:rFonts w:ascii="SimSun" w:hAnsi="SimSun" w:eastAsia="SimSun" w:cs="SimSun"/>
+          <w:sz w:val="24"/>
+          <w:szCs w:val="24"/>
+        </w:rPr>
+      </w:pPr>
+    </w:p>
+    <w:p>
+      <w:pPr>
+        <w:rPr>
+          <w:rFonts w:ascii="SimSun" w:hAnsi="SimSun" w:eastAsia="SimSun" w:cs="SimSun"/>
+          <w:sz w:val="24"/>
+          <w:szCs w:val="24"/>
+        </w:rPr>
+      </w:pPr>
+    </w:p>
+    <w:p>
+      <w:pPr>
+        <w:rPr>
+          <w:rFonts w:ascii="SimSun" w:hAnsi="SimSun" w:eastAsia="SimSun" w:cs="SimSun"/>
+          <w:sz w:val="24"/>
+          <w:szCs w:val="24"/>
+        </w:rPr>
+      </w:pPr>
+    </w:p>
+    <w:p>
+      <w:pPr>
+        <w:rPr>
+          <w:rFonts w:ascii="SimSun" w:hAnsi="SimSun" w:eastAsia="SimSun" w:cs="SimSun"/>
+          <w:sz w:val="24"/>
+          <w:szCs w:val="24"/>
+        </w:rPr>
+      </w:pPr>
+    </w:p>
+    <w:p>
+      <w:pPr>
+        <w:rPr>
+          <w:rFonts w:hint="default" w:ascii="SimSun" w:hAnsi="SimSun" w:cs="SimSun"/>
+          <w:sz w:val="24"/>
+          <w:szCs w:val="24"/>
+          <w:lang w:val="en-US"/>
+        </w:rPr>
+      </w:pPr>
+      <w:r>
+        <w:rPr>
+          <w:rFonts w:hint="default" w:ascii="SimSun" w:hAnsi="SimSun" w:cs="SimSun"/>
+          <w:sz w:val="24"/>
+          <w:szCs w:val="24"/>
+          <w:lang w:val="en-US"/>
+        </w:rPr>
+        <w:t>Claim :</w:t>
+      </w:r>
+    </w:p>
+    <w:p>
+      <w:pPr>
+        <w:rPr>
+          <w:rFonts w:hint="default" w:ascii="SimSun" w:hAnsi="SimSun" w:cs="SimSun"/>
+          <w:sz w:val="24"/>
+          <w:szCs w:val="24"/>
+          <w:lang w:val="en-US"/>
+        </w:rPr>
+      </w:pPr>
+    </w:p>
+    <w:p>
+      <w:pPr>
+        <w:rPr>
+          <w:rFonts w:hint="default" w:ascii="SimSun" w:hAnsi="SimSun" w:cs="SimSun"/>
+          <w:sz w:val="24"/>
+          <w:szCs w:val="24"/>
+          <w:lang w:val="en-US"/>
+        </w:rPr>
+      </w:pPr>
+      <w:r>
+        <w:rPr>
+          <w:rFonts w:hint="default" w:ascii="SimSun" w:hAnsi="SimSun" w:cs="SimSun"/>
+          <w:sz w:val="24"/>
+          <w:szCs w:val="24"/>
+          <w:lang w:val="en-US"/>
+        </w:rPr>
+        <w:t>This thesis proposes and implements an explainable Graph-RAG framework that maps calibrated acoustic biomarkers to clinically interpretable depression-screening narratives, using PHQ-8-aligned DAIC-WOZ calibration and graph-grounded report generation.</w:t>
       </w:r>
       <w:bookmarkStart w:id="0" w:name="_GoBack"/>
       <w:bookmarkEnd w:id="0"/>

</xml_diff>